<commit_message>
Solution8 PO and steps 1.1 and 1.2 in automation
</commit_message>
<xml_diff>
--- a/web/build/assets/Physician-order-template.docx.docx
+++ b/web/build/assets/Physician-order-template.docx.docx
@@ -17,7 +17,7 @@
           <w:b/>
           <w:sz w:val="44"/>
         </w:rPr>
-        <w:t>ALL MEDICAL LLC</w:t>
+        <w:t>SOLUTION8 MARKETING GROUP, LLC</w:t>
       </w:r>
     </w:p>
     <w:p>
@@ -98,7 +98,7 @@
           <w:sz w:val="28"/>
           <w:szCs w:val="28"/>
         </w:rPr>
-        <w:t>56</w:t>
+        <w:t>352-</w:t>
       </w:r>
       <w:r>
         <w:rPr>
@@ -107,7 +107,7 @@
           <w:sz w:val="28"/>
           <w:szCs w:val="28"/>
         </w:rPr>
-        <w:t>1-707-0965    Fax:  813-513-9479</w:t>
+        <w:t>328-8308    Fax:  813-513-9479</w:t>
       </w:r>
     </w:p>
     <w:p>
@@ -271,7 +271,7 @@
                 <w:bCs/>
                 <w:color w:val="auto"/>
               </w:rPr>
-              <w:t>561-707-0965</w:t>
+              <w:t>352-328-8308</w:t>
             </w:r>
           </w:p>
           <w:p>
@@ -2248,7 +2248,7 @@
                 <w:sz w:val="20"/>
                 <w:szCs w:val="20"/>
               </w:rPr>
-              <w:t>ALL MEDICAL, LLC</w:t>
+              <w:t>SOLUTION8 MARKETING GROUP, LLC</w:t>
             </w:r>
           </w:p>
           <w:p>
@@ -2318,7 +2318,7 @@
                 <w:sz w:val="20"/>
                 <w:szCs w:val="20"/>
               </w:rPr>
-              <w:t>: (561)707-0965</w:t>
+              <w:t>: (352)328-8308</w:t>
             </w:r>
             <w:r>
               <w:rPr>
@@ -2353,7 +2353,7 @@
                 <w:sz w:val="20"/>
                 <w:szCs w:val="20"/>
               </w:rPr>
-              <w:t>NPI #: 1407256191</w:t>
+              <w:t>NPI #: 1154271823</w:t>
             </w:r>
           </w:p>
           <w:p>

</xml_diff>